<commit_message>
Añadidos roles al identification form
</commit_message>
<xml_diff>
--- a/reports/00 - Identification Form.docx
+++ b/reports/00 - Identification Form.docx
@@ -1126,7 +1126,6 @@
             <w:placeholder>
               <w:docPart w:val="A7AE45289F684C248633B8ED2BC66CB9"/>
             </w:placeholder>
-            <w:showingPlcHdr/>
           </w:sdtPr>
           <w:sdtContent>
             <w:tc>
@@ -1145,18 +1144,42 @@
                     <w:lang w:val="es-ES"/>
                   </w:rPr>
                 </w:pPr>
+                <w:proofErr w:type="spellStart"/>
+                <w:proofErr w:type="gramStart"/>
                 <w:r>
                   <w:rPr>
-                    <w:rStyle w:val="Textodelmarcadordeposicin"/>
+                    <w:rFonts w:asciiTheme="majorHAnsi" w:eastAsia="Calibri" w:hAnsiTheme="majorHAnsi" w:cstheme="majorHAnsi"/>
                     <w:i/>
                     <w:iCs/>
                     <w:sz w:val="22"/>
                     <w:szCs w:val="22"/>
-                    <w:shd w:val="clear" w:color="auto" w:fill="FFF2CC" w:themeFill="accent4" w:themeFillTint="33"/>
-                    <w:lang w:val="es-ES"/>
                   </w:rPr>
-                  <w:t>Roles</w:t>
+                  <w:t>Manager,Analyst</w:t>
                 </w:r>
+                <w:proofErr w:type="gramEnd"/>
+                <w:r>
+                  <w:rPr>
+                    <w:rFonts w:asciiTheme="majorHAnsi" w:eastAsia="Calibri" w:hAnsiTheme="majorHAnsi" w:cstheme="majorHAnsi"/>
+                    <w:i/>
+                    <w:iCs/>
+                    <w:sz w:val="22"/>
+                    <w:szCs w:val="22"/>
+                  </w:rPr>
+                  <w:t>,</w:t>
+                </w:r>
+                <w:proofErr w:type="gramStart"/>
+                <w:r>
+                  <w:rPr>
+                    <w:rFonts w:asciiTheme="majorHAnsi" w:eastAsia="Calibri" w:hAnsiTheme="majorHAnsi" w:cstheme="majorHAnsi"/>
+                    <w:i/>
+                    <w:iCs/>
+                    <w:sz w:val="22"/>
+                    <w:szCs w:val="22"/>
+                  </w:rPr>
+                  <w:t>Developer,Tester</w:t>
+                </w:r>
+                <w:proofErr w:type="spellEnd"/>
+                <w:proofErr w:type="gramEnd"/>
               </w:p>
             </w:tc>
           </w:sdtContent>
@@ -1229,39 +1252,90 @@
             <w:placeholder>
               <w:docPart w:val="4AB32200232041A5AAE9D047CBEFE3E7"/>
             </w:placeholder>
-            <w:showingPlcHdr/>
           </w:sdtPr>
           <w:sdtContent>
-            <w:tc>
-              <w:tcPr>
-                <w:tcW w:w="3209" w:type="dxa"/>
-              </w:tcPr>
-              <w:p>
-                <w:pPr>
-                  <w:spacing w:before="0" w:after="0" w:line="240" w:lineRule="atLeast"/>
-                  <w:rPr>
-                    <w:rFonts w:asciiTheme="majorHAnsi" w:eastAsia="Calibri" w:hAnsiTheme="majorHAnsi" w:cstheme="majorHAnsi"/>
-                    <w:i/>
-                    <w:iCs/>
-                    <w:sz w:val="22"/>
-                    <w:szCs w:val="22"/>
-                    <w:lang w:val="es-ES"/>
-                  </w:rPr>
-                </w:pPr>
-                <w:r>
-                  <w:rPr>
-                    <w:rStyle w:val="Textodelmarcadordeposicin"/>
-                    <w:i/>
-                    <w:iCs/>
-                    <w:sz w:val="22"/>
-                    <w:szCs w:val="22"/>
-                    <w:shd w:val="clear" w:color="auto" w:fill="FFF2CC" w:themeFill="accent4" w:themeFillTint="33"/>
-                    <w:lang w:val="es-ES"/>
-                  </w:rPr>
-                  <w:t>Roles</w:t>
-                </w:r>
-              </w:p>
-            </w:tc>
+            <w:sdt>
+              <w:sdtPr>
+                <w:rPr>
+                  <w:rFonts w:asciiTheme="majorHAnsi" w:eastAsia="Calibri" w:hAnsiTheme="majorHAnsi" w:cstheme="majorHAnsi"/>
+                  <w:i/>
+                  <w:iCs/>
+                  <w:sz w:val="22"/>
+                  <w:szCs w:val="22"/>
+                </w:rPr>
+                <w:id w:val="1391377409"/>
+                <w:placeholder>
+                  <w:docPart w:val="A2055AA91B21469186F0A68A7D56AE2F"/>
+                </w:placeholder>
+              </w:sdtPr>
+              <w:sdtEndPr/>
+              <w:sdtContent>
+                <w:tc>
+                  <w:tcPr>
+                    <w:tcW w:w="3209" w:type="dxa"/>
+                  </w:tcPr>
+                  <w:p>
+                    <w:pPr>
+                      <w:spacing w:before="0" w:after="0" w:line="240" w:lineRule="atLeast"/>
+                      <w:rPr>
+                        <w:rFonts w:asciiTheme="majorHAnsi" w:eastAsia="Calibri" w:hAnsiTheme="majorHAnsi" w:cstheme="majorHAnsi"/>
+                        <w:i/>
+                        <w:iCs/>
+                        <w:sz w:val="22"/>
+                        <w:szCs w:val="22"/>
+                        <w:lang w:val="es-ES"/>
+                      </w:rPr>
+                    </w:pPr>
+                    <w:proofErr w:type="spellStart"/>
+                    <w:proofErr w:type="gramStart"/>
+                    <w:r>
+                      <w:rPr>
+                        <w:rFonts w:asciiTheme="majorHAnsi" w:eastAsia="Calibri" w:hAnsiTheme="majorHAnsi" w:cstheme="majorHAnsi"/>
+                        <w:i/>
+                        <w:iCs/>
+                        <w:sz w:val="22"/>
+                        <w:szCs w:val="22"/>
+                      </w:rPr>
+                      <w:t>Operator</w:t>
+                    </w:r>
+                    <w:r>
+                      <w:rPr>
+                        <w:rFonts w:asciiTheme="majorHAnsi" w:eastAsia="Calibri" w:hAnsiTheme="majorHAnsi" w:cstheme="majorHAnsi"/>
+                        <w:i/>
+                        <w:iCs/>
+                        <w:sz w:val="22"/>
+                        <w:szCs w:val="22"/>
+                      </w:rPr>
+                      <w:t>,Analyst</w:t>
+                    </w:r>
+                    <w:proofErr w:type="gramEnd"/>
+                    <w:r>
+                      <w:rPr>
+                        <w:rFonts w:asciiTheme="majorHAnsi" w:eastAsia="Calibri" w:hAnsiTheme="majorHAnsi" w:cstheme="majorHAnsi"/>
+                        <w:i/>
+                        <w:iCs/>
+                        <w:sz w:val="22"/>
+                        <w:szCs w:val="22"/>
+                      </w:rPr>
+                      <w:t>,</w:t>
+                    </w:r>
+                    <w:proofErr w:type="gramStart"/>
+                    <w:r>
+                      <w:rPr>
+                        <w:rFonts w:asciiTheme="majorHAnsi" w:eastAsia="Calibri" w:hAnsiTheme="majorHAnsi" w:cstheme="majorHAnsi"/>
+                        <w:i/>
+                        <w:iCs/>
+                        <w:sz w:val="22"/>
+                        <w:szCs w:val="22"/>
+                      </w:rPr>
+                      <w:t>Developer,Tester</w:t>
+                    </w:r>
+                    <w:proofErr w:type="spellEnd"/>
+                    <w:proofErr w:type="gramEnd"/>
+                  </w:p>
+                </w:tc>
+              </w:sdtContent>
+            </w:sdt>
           </w:sdtContent>
         </w:sdt>
       </w:tr>
@@ -1929,39 +2003,68 @@
             <w:placeholder>
               <w:docPart w:val="6B5FFBB2718245888FF8C980710E55F7"/>
             </w:placeholder>
-            <w:showingPlcHdr/>
           </w:sdtPr>
           <w:sdtContent>
-            <w:tc>
-              <w:tcPr>
-                <w:tcW w:w="3237" w:type="dxa"/>
-              </w:tcPr>
-              <w:p>
-                <w:pPr>
-                  <w:spacing w:before="0" w:after="0" w:line="240" w:lineRule="atLeast"/>
-                  <w:rPr>
-                    <w:rFonts w:asciiTheme="majorHAnsi" w:eastAsia="Calibri" w:hAnsiTheme="majorHAnsi" w:cstheme="majorHAnsi"/>
-                    <w:i/>
-                    <w:iCs/>
-                    <w:sz w:val="22"/>
-                    <w:szCs w:val="22"/>
-                    <w:lang w:val="es-ES"/>
-                  </w:rPr>
-                </w:pPr>
-                <w:r>
-                  <w:rPr>
-                    <w:rStyle w:val="Textodelmarcadordeposicin"/>
-                    <w:i/>
-                    <w:iCs/>
-                    <w:sz w:val="22"/>
-                    <w:szCs w:val="22"/>
-                    <w:shd w:val="clear" w:color="auto" w:fill="FFF2CC" w:themeFill="accent4" w:themeFillTint="33"/>
-                    <w:lang w:val="es-ES"/>
-                  </w:rPr>
-                  <w:t>Roles</w:t>
-                </w:r>
-              </w:p>
-            </w:tc>
+            <w:sdt>
+              <w:sdtPr>
+                <w:rPr>
+                  <w:rFonts w:asciiTheme="majorHAnsi" w:eastAsia="Calibri" w:hAnsiTheme="majorHAnsi" w:cstheme="majorHAnsi"/>
+                  <w:i/>
+                  <w:iCs/>
+                  <w:sz w:val="22"/>
+                  <w:szCs w:val="22"/>
+                </w:rPr>
+                <w:id w:val="1529988693"/>
+                <w:placeholder>
+                  <w:docPart w:val="E86076892595417493EBC8EB13539FEC"/>
+                </w:placeholder>
+              </w:sdtPr>
+              <w:sdtEndPr/>
+              <w:sdtContent>
+                <w:tc>
+                  <w:tcPr>
+                    <w:tcW w:w="3237" w:type="dxa"/>
+                  </w:tcPr>
+                  <w:p>
+                    <w:pPr>
+                      <w:spacing w:before="0" w:after="0" w:line="240" w:lineRule="atLeast"/>
+                      <w:rPr>
+                        <w:rFonts w:asciiTheme="majorHAnsi" w:eastAsia="Calibri" w:hAnsiTheme="majorHAnsi" w:cstheme="majorHAnsi"/>
+                        <w:i/>
+                        <w:iCs/>
+                        <w:sz w:val="22"/>
+                        <w:szCs w:val="22"/>
+                        <w:lang w:val="es-ES"/>
+                      </w:rPr>
+                    </w:pPr>
+                    <w:proofErr w:type="spellStart"/>
+                    <w:proofErr w:type="gramStart"/>
+                    <w:r>
+                      <w:rPr>
+                        <w:rFonts w:asciiTheme="majorHAnsi" w:eastAsia="Calibri" w:hAnsiTheme="majorHAnsi" w:cstheme="majorHAnsi"/>
+                        <w:i/>
+                        <w:iCs/>
+                        <w:sz w:val="22"/>
+                        <w:szCs w:val="22"/>
+                      </w:rPr>
+                      <w:t>Analyst,Developer</w:t>
+                    </w:r>
+                    <w:proofErr w:type="gramEnd"/>
+                    <w:r>
+                      <w:rPr>
+                        <w:rFonts w:asciiTheme="majorHAnsi" w:eastAsia="Calibri" w:hAnsiTheme="majorHAnsi" w:cstheme="majorHAnsi"/>
+                        <w:i/>
+                        <w:iCs/>
+                        <w:sz w:val="22"/>
+                        <w:szCs w:val="22"/>
+                      </w:rPr>
+                      <w:t>,Tester</w:t>
+                    </w:r>
+                    <w:proofErr w:type="spellEnd"/>
+                  </w:p>
+                </w:tc>
+              </w:sdtContent>
+            </w:sdt>
           </w:sdtContent>
         </w:sdt>
         <w:tc>
@@ -2032,39 +2135,54 @@
             <w:placeholder>
               <w:docPart w:val="236435531F2D4632BB7DCEAA5677A7DA"/>
             </w:placeholder>
-            <w:showingPlcHdr/>
           </w:sdtPr>
           <w:sdtContent>
-            <w:tc>
-              <w:tcPr>
-                <w:tcW w:w="3209" w:type="dxa"/>
-              </w:tcPr>
-              <w:p>
-                <w:pPr>
-                  <w:spacing w:before="0" w:after="0" w:line="240" w:lineRule="atLeast"/>
-                  <w:rPr>
-                    <w:rFonts w:asciiTheme="majorHAnsi" w:eastAsia="Calibri" w:hAnsiTheme="majorHAnsi" w:cstheme="majorHAnsi"/>
-                    <w:i/>
-                    <w:iCs/>
-                    <w:sz w:val="22"/>
-                    <w:szCs w:val="22"/>
-                    <w:lang w:val="es-ES"/>
-                  </w:rPr>
-                </w:pPr>
-                <w:r>
-                  <w:rPr>
-                    <w:rStyle w:val="Textodelmarcadordeposicin"/>
-                    <w:i/>
-                    <w:iCs/>
-                    <w:sz w:val="22"/>
-                    <w:szCs w:val="22"/>
-                    <w:shd w:val="clear" w:color="auto" w:fill="FFF2CC" w:themeFill="accent4" w:themeFillTint="33"/>
-                    <w:lang w:val="es-ES"/>
-                  </w:rPr>
-                  <w:t>Roles</w:t>
-                </w:r>
-              </w:p>
-            </w:tc>
+            <w:sdt>
+              <w:sdtPr>
+                <w:rPr>
+                  <w:rFonts w:asciiTheme="majorHAnsi" w:eastAsia="Calibri" w:hAnsiTheme="majorHAnsi" w:cstheme="majorHAnsi"/>
+                  <w:i/>
+                  <w:iCs/>
+                  <w:sz w:val="22"/>
+                  <w:szCs w:val="22"/>
+                </w:rPr>
+                <w:id w:val="-652683176"/>
+                <w:placeholder>
+                  <w:docPart w:val="0C36923337EB466894F7402952DD42FB"/>
+                </w:placeholder>
+              </w:sdtPr>
+              <w:sdtEndPr/>
+              <w:sdtContent>
+                <w:tc>
+                  <w:tcPr>
+                    <w:tcW w:w="3209" w:type="dxa"/>
+                  </w:tcPr>
+                  <w:p>
+                    <w:pPr>
+                      <w:spacing w:before="0" w:after="0" w:line="240" w:lineRule="atLeast"/>
+                      <w:rPr>
+                        <w:rFonts w:asciiTheme="majorHAnsi" w:eastAsia="Calibri" w:hAnsiTheme="majorHAnsi" w:cstheme="majorHAnsi"/>
+                        <w:i/>
+                        <w:iCs/>
+                        <w:sz w:val="22"/>
+                        <w:szCs w:val="22"/>
+                        <w:lang w:val="es-ES"/>
+                      </w:rPr>
+                    </w:pPr>
+                    <w:r>
+                      <w:rPr>
+                        <w:rFonts w:asciiTheme="majorHAnsi" w:eastAsia="Calibri" w:hAnsiTheme="majorHAnsi" w:cstheme="majorHAnsi"/>
+                        <w:i/>
+                        <w:iCs/>
+                        <w:sz w:val="22"/>
+                        <w:szCs w:val="22"/>
+                      </w:rPr>
+                      <w:t>Analyst,Developer,Tester</w:t>
+                    </w:r>
+                  </w:p>
+                </w:tc>
+              </w:sdtContent>
+            </w:sdt>
           </w:sdtContent>
         </w:sdt>
       </w:tr>
@@ -5289,6 +5407,99 @@
         </w:p>
       </w:docPartBody>
     </w:docPart>
+    <w:docPart>
+      <w:docPartPr>
+        <w:name w:val="A2055AA91B21469186F0A68A7D56AE2F"/>
+        <w:category>
+          <w:name w:val="General"/>
+          <w:gallery w:val="placeholder"/>
+        </w:category>
+        <w:types>
+          <w:type w:val="bbPlcHdr"/>
+        </w:types>
+        <w:behaviors>
+          <w:behavior w:val="content"/>
+        </w:behaviors>
+        <w:guid w:val="{42362D8E-A4B1-4816-A604-5574287129AA}"/>
+      </w:docPartPr>
+      <w:docPartBody>
+        <w:p>
+          <w:pPr>
+            <w:pStyle w:val="A2055AA91B21469186F0A68A7D56AE2F"/>
+          </w:pPr>
+          <w:r>
+            <w:rPr>
+              <w:rStyle w:val="Textodelmarcadordeposicin"/>
+              <w:i/>
+              <w:iCs/>
+            </w:rPr>
+            <w:t>Roles</w:t>
+          </w:r>
+        </w:p>
+      </w:docPartBody>
+    </w:docPart>
+    <w:docPart>
+      <w:docPartPr>
+        <w:name w:val="E86076892595417493EBC8EB13539FEC"/>
+        <w:category>
+          <w:name w:val="General"/>
+          <w:gallery w:val="placeholder"/>
+        </w:category>
+        <w:types>
+          <w:type w:val="bbPlcHdr"/>
+        </w:types>
+        <w:behaviors>
+          <w:behavior w:val="content"/>
+        </w:behaviors>
+        <w:guid w:val="{59709A3C-C63A-4994-8A85-C4F2DA0CDD81}"/>
+      </w:docPartPr>
+      <w:docPartBody>
+        <w:p>
+          <w:pPr>
+            <w:pStyle w:val="E86076892595417493EBC8EB13539FEC"/>
+          </w:pPr>
+          <w:r>
+            <w:rPr>
+              <w:rStyle w:val="Textodelmarcadordeposicin"/>
+              <w:i/>
+              <w:iCs/>
+            </w:rPr>
+            <w:t>Roles</w:t>
+          </w:r>
+        </w:p>
+      </w:docPartBody>
+    </w:docPart>
+    <w:docPart>
+      <w:docPartPr>
+        <w:name w:val="0C36923337EB466894F7402952DD42FB"/>
+        <w:category>
+          <w:name w:val="General"/>
+          <w:gallery w:val="placeholder"/>
+        </w:category>
+        <w:types>
+          <w:type w:val="bbPlcHdr"/>
+        </w:types>
+        <w:behaviors>
+          <w:behavior w:val="content"/>
+        </w:behaviors>
+        <w:guid w:val="{9886C5C3-6624-4FBC-82E5-9A4B2849D05F}"/>
+      </w:docPartPr>
+      <w:docPartBody>
+        <w:p>
+          <w:pPr>
+            <w:pStyle w:val="0C36923337EB466894F7402952DD42FB"/>
+          </w:pPr>
+          <w:r>
+            <w:rPr>
+              <w:rStyle w:val="Textodelmarcadordeposicin"/>
+              <w:i/>
+              <w:iCs/>
+            </w:rPr>
+            <w:t>Roles</w:t>
+          </w:r>
+        </w:p>
+      </w:docPartBody>
+    </w:docPart>
   </w:docParts>
 </w:glossaryDocument>
 </file>
@@ -5399,6 +5610,7 @@
     <w:rsid w:val="00212213"/>
     <w:rsid w:val="00213D82"/>
     <w:rsid w:val="00314F21"/>
+    <w:rsid w:val="00371025"/>
     <w:rsid w:val="003E40EE"/>
     <w:rsid w:val="004C28F8"/>
     <w:rsid w:val="005C7F03"/>
@@ -5417,10 +5629,12 @@
     <w:rsid w:val="00B847D5"/>
     <w:rsid w:val="00BA349C"/>
     <w:rsid w:val="00C1468D"/>
+    <w:rsid w:val="00C207DA"/>
     <w:rsid w:val="00C919A2"/>
     <w:rsid w:val="00CE21C4"/>
     <w:rsid w:val="00DC6B61"/>
     <w:rsid w:val="00DD76BC"/>
+    <w:rsid w:val="00DF17E8"/>
     <w:rsid w:val="00E566B1"/>
     <w:rsid w:val="00E77A2D"/>
   </w:rsids>
@@ -5878,7 +6092,7 @@
     <w:basedOn w:val="Fuentedeprrafopredeter"/>
     <w:uiPriority w:val="99"/>
     <w:semiHidden/>
-    <w:rsid w:val="00743CC5"/>
+    <w:rsid w:val="00371025"/>
     <w:rPr>
       <w:color w:val="808080"/>
     </w:rPr>
@@ -6165,6 +6379,27 @@
     <w:rPr>
       <w:rFonts w:eastAsiaTheme="minorHAnsi"/>
       <w:lang w:eastAsia="en-US"/>
+    </w:rPr>
+  </w:style>
+  <w:style w:type="paragraph" w:customStyle="1" w:styleId="A2055AA91B21469186F0A68A7D56AE2F">
+    <w:name w:val="A2055AA91B21469186F0A68A7D56AE2F"/>
+    <w:rsid w:val="00371025"/>
+    <w:rPr>
+      <w:lang w:val="es-ES" w:eastAsia="es-ES"/>
+    </w:rPr>
+  </w:style>
+  <w:style w:type="paragraph" w:customStyle="1" w:styleId="E86076892595417493EBC8EB13539FEC">
+    <w:name w:val="E86076892595417493EBC8EB13539FEC"/>
+    <w:rsid w:val="00371025"/>
+    <w:rPr>
+      <w:lang w:val="es-ES" w:eastAsia="es-ES"/>
+    </w:rPr>
+  </w:style>
+  <w:style w:type="paragraph" w:customStyle="1" w:styleId="0C36923337EB466894F7402952DD42FB">
+    <w:name w:val="0C36923337EB466894F7402952DD42FB"/>
+    <w:rsid w:val="00371025"/>
+    <w:rPr>
+      <w:lang w:val="es-ES" w:eastAsia="es-ES"/>
     </w:rPr>
   </w:style>
 </w:styles>

</xml_diff>